<commit_message>
add administrasi pendidik new, rpp modul ajar
</commit_message>
<xml_diff>
--- a/Laporan Observasi/Laporan Observasi PK - Raiya Yusuf Priatmojo.docx
+++ b/Laporan Observasi/Laporan Observasi PK - Raiya Yusuf Priatmojo.docx
@@ -174,7 +174,7 @@
           </mc:Choice>
           <mc:Fallback>
             <w:pict>
-              <v:shape w14:anchorId="45C6AC19" id="Graphic 3" o:spid="_x0000_s1026" style="position:absolute;margin-left:21.5pt;margin-top:98.65pt;width:758.15pt;height:.1pt;z-index:15729664;visibility:visible;mso-wrap-style:square;mso-wrap-distance-left:0;mso-wrap-distance-top:0;mso-wrap-distance-right:0;mso-wrap-distance-bottom:0;mso-position-horizontal:absolute;mso-position-horizontal-relative:page;mso-position-vertical:absolute;mso-position-vertical-relative:page;v-text-anchor:top" coordsize="9628505,1270" o:gfxdata="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" path="m,l9628505,e" filled="f" strokeweight="1.5pt">
+              <v:shape w14:anchorId="403B1D96" id="Graphic 3" o:spid="_x0000_s1026" style="position:absolute;margin-left:21.5pt;margin-top:98.65pt;width:758.15pt;height:.1pt;z-index:15729664;visibility:visible;mso-wrap-style:square;mso-wrap-distance-left:0;mso-wrap-distance-top:0;mso-wrap-distance-right:0;mso-wrap-distance-bottom:0;mso-position-horizontal:absolute;mso-position-horizontal-relative:page;mso-position-vertical:absolute;mso-position-vertical-relative:page;v-text-anchor:top" coordsize="9628505,1270" o:gfxdata="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" path="m,l9628505,e" filled="f" strokeweight="1.5pt">
                 <v:path arrowok="t"/>
                 <w10:wrap anchorx="page" anchory="page"/>
               </v:shape>
@@ -2439,7 +2439,7 @@
                 </mc:Choice>
                 <mc:Fallback>
                   <w:pict>
-                    <v:group w14:anchorId="496DE568" id="Group 10" o:spid="_x0000_s1026" style="width:161.1pt;height:61.25pt;mso-position-horizontal-relative:char;mso-position-vertical-relative:line" coordsize="20459,7778" o:gfxdata="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">
+                    <v:group w14:anchorId="46C04759" id="Group 10" o:spid="_x0000_s1026" style="width:161.1pt;height:61.25pt;mso-position-horizontal-relative:char;mso-position-vertical-relative:line" coordsize="20459,7778" o:gfxdata="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">
                       <v:shapetype id="_x0000_t75" coordsize="21600,21600" o:spt="75" o:preferrelative="t" path="m@4@5l@4@11@9@11@9@5xe" filled="f" stroked="f">
                         <v:stroke joinstyle="miter"/>
                         <v:formulas>
@@ -2568,7 +2568,7 @@
                 </mc:Choice>
                 <mc:Fallback>
                   <w:pict>
-                    <v:group w14:anchorId="0355A4B6" id="Group 13" o:spid="_x0000_s1026" style="width:161.1pt;height:61.3pt;mso-position-horizontal-relative:char;mso-position-vertical-relative:line" coordsize="20459,7785" o:gfxdata="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">
+                    <v:group w14:anchorId="3A0EC450" id="Group 13" o:spid="_x0000_s1026" style="width:161.1pt;height:61.3pt;mso-position-horizontal-relative:char;mso-position-vertical-relative:line" coordsize="20459,7785" o:gfxdata="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">
                       <v:shape id="Image 14" o:spid="_x0000_s1027" type="#_x0000_t75" style="position:absolute;width:10329;height:7747;visibility:visible;mso-wrap-style:square" o:gfxdata="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">
                         <v:imagedata r:id="rId18" o:title=""/>
                       </v:shape>
@@ -8700,7 +8700,7 @@
                 </mc:Choice>
                 <mc:Fallback>
                   <w:pict>
-                    <v:group w14:anchorId="201F74C8" id="Group 34" o:spid="_x0000_s1026" style="width:144.55pt;height:70.5pt;mso-position-horizontal-relative:char;mso-position-vertical-relative:line" coordsize="18357,8953" o:gfxdata="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">
+                    <v:group w14:anchorId="55D746BD" id="Group 34" o:spid="_x0000_s1026" style="width:144.55pt;height:70.5pt;mso-position-horizontal-relative:char;mso-position-vertical-relative:line" coordsize="18357,8953" o:gfxdata="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">
                       <v:shape id="Image 35" o:spid="_x0000_s1027" type="#_x0000_t75" style="position:absolute;top:169;width:11709;height:8782;visibility:visible;mso-wrap-style:square" o:gfxdata="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">
                         <v:imagedata r:id="rId40" o:title=""/>
                       </v:shape>
@@ -9354,10 +9354,7 @@
         <w:ind w:left="70"/>
       </w:pPr>
       <w:r>
-        <w:t xml:space="preserve">     </w:t>
-      </w:r>
-      <w:r>
-        <w:t>Widada,</w:t>
+        <w:t xml:space="preserve">     Widada,</w:t>
       </w:r>
       <w:r>
         <w:rPr>
@@ -9403,7 +9400,7 @@
         <w:rPr>
           <w:spacing w:val="-2"/>
         </w:rPr>
-        <w:t>196308301987031003</w:t>
+        <w:t>196902122000121002</w:t>
       </w:r>
     </w:p>
     <w:p>
@@ -9494,13 +9491,7 @@
         <w:ind w:right="3344"/>
       </w:pPr>
       <w:r>
-        <w:t xml:space="preserve">  </w:t>
-      </w:r>
-      <w:r>
-        <w:t xml:space="preserve">NIM. </w:t>
-      </w:r>
-      <w:r>
-        <w:t>22518244004</w:t>
+        <w:t xml:space="preserve">  NIM. 22518244004</w:t>
       </w:r>
     </w:p>
     <w:sectPr>

</xml_diff>